<commit_message>
docs: shorten presentation text a bit
</commit_message>
<xml_diff>
--- a/docs/Текст презентації.docx
+++ b/docs/Текст презентації.docx
@@ -8,6 +8,7 @@
           <w:rFonts w:ascii="Times New Roman" w:hAnsi="Times New Roman" w:cs="Times New Roman"/>
           <w:sz w:val="36"/>
           <w:szCs w:val="36"/>
+          <w:lang w:val="uk-UA"/>
         </w:rPr>
       </w:pPr>
     </w:p>
@@ -324,15 +325,15 @@
           <w:sz w:val="36"/>
           <w:szCs w:val="36"/>
         </w:rPr>
-        <w:t>Алгоритм дельта-степінгу є унікальною комбінацією підходів Дейкстри та Беллмана-Форда. Основна ідея полягає у розбитті вершин графа на так звані «кошики» залежно від поточної відстані до них. Ширина кожного кошика визначається параметром дельта. Усі вершини, що потрапляють в один кошик,</w:t>
-      </w:r>
-      <w:r>
-        <w:rPr>
-          <w:rFonts w:ascii="Times New Roman" w:hAnsi="Times New Roman" w:cs="Times New Roman"/>
-          <w:sz w:val="36"/>
-          <w:szCs w:val="36"/>
-        </w:rPr>
-        <w:t xml:space="preserve"> можуть оброблятися паралельно.</w:t>
+        <w:t>Алгоритм дельта-степінгу –</w:t>
+      </w:r>
+      <w:r>
+        <w:rPr>
+          <w:rFonts w:ascii="Times New Roman" w:hAnsi="Times New Roman" w:cs="Times New Roman"/>
+          <w:sz w:val="36"/>
+          <w:szCs w:val="36"/>
+        </w:rPr>
+        <w:t xml:space="preserve"> це гібрид Дейкстри та Беллмана-Форда. Ми розбиваємо вершини на кошики шириною дельта. Усі вершини в одному кошику обробляються паралельно. </w:t>
       </w:r>
     </w:p>
     <w:p>
@@ -351,16 +352,280 @@
           <w:sz w:val="36"/>
           <w:szCs w:val="36"/>
         </w:rPr>
-        <w:t xml:space="preserve">Процес обробки поділяється на роботу з «легкими» та «важкими» ребрами. Легкі ребра (вага яких менша за дельта) можуть призводити до появи нових вершин у тому самому кошику, тому вони потребують ітеративної обробки всередині фази. Важкі ребра гарантовано виносять вершини </w:t>
-      </w:r>
-      <w:r>
-        <w:rPr>
-          <w:rFonts w:ascii="Times New Roman" w:hAnsi="Times New Roman" w:cs="Times New Roman"/>
-          <w:sz w:val="36"/>
-          <w:szCs w:val="36"/>
+        <w:t>Робота ділиться на «легкі» та «важкі» ребра. Легкі ребра (вага &lt; дельта) обробляються ітеративно всередині кошика, оскільки можуть змінювати стан сусідів у тому ж сегменті. Важкі ребра гарантовано виносять вершини у наступні кошики. Параметр дельта дозволяє нам балансувати між ступенем паралелізму та кількістю повторних обчислень.</w:t>
+      </w:r>
+    </w:p>
+    <w:p>
+      <w:pPr>
+        <w:jc w:val="both"/>
+        <w:rPr>
+          <w:rFonts w:ascii="Times New Roman" w:hAnsi="Times New Roman" w:cs="Times New Roman"/>
+          <w:b/>
+          <w:sz w:val="48"/>
+          <w:szCs w:val="48"/>
+          <w:lang w:val="uk-UA"/>
+        </w:rPr>
+      </w:pPr>
+      <w:r>
+        <w:rPr>
+          <w:rFonts w:ascii="Times New Roman" w:hAnsi="Times New Roman" w:cs="Times New Roman"/>
+          <w:b/>
+          <w:sz w:val="48"/>
+          <w:szCs w:val="48"/>
         </w:rPr>
         <w:lastRenderedPageBreak/>
-        <w:t>у наступні коши</w:t>
+        <w:t>Слайд</w:t>
+      </w:r>
+      <w:r>
+        <w:rPr>
+          <w:rFonts w:ascii="Times New Roman" w:hAnsi="Times New Roman" w:cs="Times New Roman"/>
+          <w:b/>
+          <w:sz w:val="48"/>
+          <w:szCs w:val="48"/>
+          <w:lang w:val="uk-UA"/>
+        </w:rPr>
+        <w:t xml:space="preserve"> 5</w:t>
+      </w:r>
+    </w:p>
+    <w:p>
+      <w:pPr>
+        <w:ind w:firstLine="708"/>
+        <w:jc w:val="both"/>
+        <w:rPr>
+          <w:rFonts w:ascii="Times New Roman" w:hAnsi="Times New Roman" w:cs="Times New Roman"/>
+          <w:sz w:val="36"/>
+          <w:szCs w:val="36"/>
+        </w:rPr>
+      </w:pPr>
+      <w:r>
+        <w:rPr>
+          <w:rFonts w:ascii="Times New Roman" w:hAnsi="Times New Roman" w:cs="Times New Roman"/>
+          <w:sz w:val="36"/>
+          <w:szCs w:val="36"/>
+        </w:rPr>
+        <w:t>Як відомо, головною перепоною для розпаралелювання в Python є GIL (Глобальне блокування інтерпретатора). Тому замість потоків я використав незалежні процеси через модуль multiprocessing. А щоб уникнути катастрофічних затримок на копіюванні графів між процесами, я повністю розмістив усі структури даних у спільній пам'яті за допомогою SharedMemory з бібліотеки NumPy.</w:t>
+      </w:r>
+    </w:p>
+    <w:p>
+      <w:pPr>
+        <w:rPr>
+          <w:rFonts w:ascii="Times New Roman" w:hAnsi="Times New Roman" w:cs="Times New Roman"/>
+          <w:b/>
+          <w:sz w:val="48"/>
+          <w:szCs w:val="48"/>
+          <w:lang w:val="uk-UA"/>
+        </w:rPr>
+      </w:pPr>
+      <w:r>
+        <w:rPr>
+          <w:rFonts w:ascii="Times New Roman" w:hAnsi="Times New Roman" w:cs="Times New Roman"/>
+          <w:b/>
+          <w:sz w:val="48"/>
+          <w:szCs w:val="48"/>
+        </w:rPr>
+        <w:t xml:space="preserve">Слайд </w:t>
+      </w:r>
+      <w:r>
+        <w:rPr>
+          <w:rFonts w:ascii="Times New Roman" w:hAnsi="Times New Roman" w:cs="Times New Roman"/>
+          <w:b/>
+          <w:sz w:val="48"/>
+          <w:szCs w:val="48"/>
+          <w:lang w:val="uk-UA"/>
+        </w:rPr>
+        <w:t>6</w:t>
+      </w:r>
+    </w:p>
+    <w:p>
+      <w:pPr>
+        <w:ind w:firstLine="708"/>
+        <w:jc w:val="both"/>
+        <w:rPr>
+          <w:rFonts w:ascii="Times New Roman" w:hAnsi="Times New Roman" w:cs="Times New Roman"/>
+          <w:sz w:val="36"/>
+          <w:szCs w:val="36"/>
+        </w:rPr>
+      </w:pPr>
+      <w:r>
+        <w:rPr>
+          <w:rFonts w:ascii="Times New Roman" w:hAnsi="Times New Roman" w:cs="Times New Roman"/>
+          <w:sz w:val="36"/>
+          <w:szCs w:val="36"/>
+        </w:rPr>
+        <w:t>Для безпечної роботи зі спільною пам'яттю було реалізовано дворівневе гранулярне блокування. Я</w:t>
+      </w:r>
+      <w:r>
+        <w:rPr>
+          <w:rFonts w:ascii="Times New Roman" w:hAnsi="Times New Roman" w:cs="Times New Roman"/>
+          <w:sz w:val="36"/>
+          <w:szCs w:val="36"/>
+        </w:rPr>
+        <w:t xml:space="preserve"> використав незалежні м'</w:t>
+      </w:r>
+      <w:r>
+        <w:rPr>
+          <w:rFonts w:ascii="Times New Roman" w:hAnsi="Times New Roman" w:cs="Times New Roman"/>
+          <w:sz w:val="36"/>
+          <w:szCs w:val="36"/>
+        </w:rPr>
+        <w:t>ютекси –</w:t>
+      </w:r>
+      <w:r>
+        <w:rPr>
+          <w:rFonts w:ascii="Times New Roman" w:hAnsi="Times New Roman" w:cs="Times New Roman"/>
+          <w:sz w:val="36"/>
+          <w:szCs w:val="36"/>
+        </w:rPr>
+        <w:t xml:space="preserve"> окремо для масиву відстаней і окремо для масиву кошиків. Крім того,</w:t>
+      </w:r>
+      <w:r>
+        <w:rPr>
+          <w:rFonts w:ascii="Times New Roman" w:hAnsi="Times New Roman" w:cs="Times New Roman"/>
+          <w:sz w:val="36"/>
+          <w:szCs w:val="36"/>
+        </w:rPr>
+        <w:t xml:space="preserve"> задля забезпечення якумога меншої кількості блокувань,</w:t>
+      </w:r>
+      <w:r>
+        <w:rPr>
+          <w:rFonts w:ascii="Times New Roman" w:hAnsi="Times New Roman" w:cs="Times New Roman"/>
+          <w:sz w:val="36"/>
+          <w:szCs w:val="36"/>
+        </w:rPr>
+        <w:t xml:space="preserve"> робочі процеси спочатку акумулюють знайдені шляхи локально, і лише потім пакето</w:t>
+      </w:r>
+      <w:r>
+        <w:rPr>
+          <w:rFonts w:ascii="Times New Roman" w:hAnsi="Times New Roman" w:cs="Times New Roman"/>
+          <w:sz w:val="36"/>
+          <w:szCs w:val="36"/>
+        </w:rPr>
+        <w:t>м скидають їх у спільну пам'ять.</w:t>
+      </w:r>
+    </w:p>
+    <w:p>
+      <w:pPr>
+        <w:rPr>
+          <w:rFonts w:ascii="Times New Roman" w:hAnsi="Times New Roman" w:cs="Times New Roman"/>
+          <w:b/>
+          <w:sz w:val="48"/>
+          <w:szCs w:val="48"/>
+          <w:lang w:val="uk-UA"/>
+        </w:rPr>
+      </w:pPr>
+      <w:r>
+        <w:rPr>
+          <w:rFonts w:ascii="Times New Roman" w:hAnsi="Times New Roman" w:cs="Times New Roman"/>
+          <w:b/>
+          <w:sz w:val="48"/>
+          <w:szCs w:val="48"/>
+        </w:rPr>
+        <w:t xml:space="preserve">Слайд </w:t>
+      </w:r>
+      <w:r>
+        <w:rPr>
+          <w:rFonts w:ascii="Times New Roman" w:hAnsi="Times New Roman" w:cs="Times New Roman"/>
+          <w:b/>
+          <w:sz w:val="48"/>
+          <w:szCs w:val="48"/>
+          <w:lang w:val="uk-UA"/>
+        </w:rPr>
+        <w:t>7</w:t>
+      </w:r>
+    </w:p>
+    <w:p>
+      <w:pPr>
+        <w:jc w:val="both"/>
+        <w:rPr>
+          <w:rFonts w:ascii="Times New Roman" w:hAnsi="Times New Roman" w:cs="Times New Roman"/>
+          <w:sz w:val="36"/>
+          <w:szCs w:val="36"/>
+          <w:lang w:val="uk-UA"/>
+        </w:rPr>
+      </w:pPr>
+      <w:r>
+        <w:rPr>
+          <w:rFonts w:ascii="Times New Roman" w:hAnsi="Times New Roman" w:cs="Times New Roman"/>
+          <w:sz w:val="36"/>
+          <w:szCs w:val="36"/>
+        </w:rPr>
+        <w:tab/>
+      </w:r>
+      <w:r>
+        <w:rPr>
+          <w:rFonts w:ascii="Times New Roman" w:hAnsi="Times New Roman" w:cs="Times New Roman"/>
+          <w:sz w:val="36"/>
+          <w:szCs w:val="36"/>
+          <w:lang w:val="uk-UA"/>
+        </w:rPr>
+        <w:t>Далі перейдемо до аналізу прискорення та ефективності паралельної версії алгоритму у порівнянні із послідовною.</w:t>
+      </w:r>
+      <w:r>
+        <w:rPr>
+          <w:rFonts w:ascii="Times New Roman" w:hAnsi="Times New Roman" w:cs="Times New Roman"/>
+          <w:sz w:val="36"/>
+          <w:szCs w:val="36"/>
+        </w:rPr>
+        <w:t xml:space="preserve"> В</w:t>
+      </w:r>
+      <w:r>
+        <w:rPr>
+          <w:rFonts w:ascii="Times New Roman" w:hAnsi="Times New Roman" w:cs="Times New Roman"/>
+          <w:sz w:val="36"/>
+          <w:szCs w:val="36"/>
+        </w:rPr>
+        <w:t>арто зазнчити, що тестування провидлося на системі із 8 ядрами</w:t>
+      </w:r>
+      <w:r>
+        <w:rPr>
+          <w:rFonts w:ascii="Times New Roman" w:hAnsi="Times New Roman" w:cs="Times New Roman"/>
+          <w:sz w:val="36"/>
+          <w:szCs w:val="36"/>
+          <w:lang w:val="uk-UA"/>
+        </w:rPr>
+        <w:t xml:space="preserve"> та 16 потоками. </w:t>
+      </w:r>
+    </w:p>
+    <w:p>
+      <w:pPr>
+        <w:ind w:firstLine="708"/>
+        <w:jc w:val="both"/>
+        <w:rPr>
+          <w:rFonts w:ascii="Times New Roman" w:hAnsi="Times New Roman" w:cs="Times New Roman"/>
+          <w:sz w:val="36"/>
+          <w:szCs w:val="36"/>
+          <w:lang w:val="uk-UA"/>
+        </w:rPr>
+      </w:pPr>
+      <w:r>
+        <w:rPr>
+          <w:rFonts w:ascii="Times New Roman" w:hAnsi="Times New Roman" w:cs="Times New Roman"/>
+          <w:sz w:val="36"/>
+          <w:szCs w:val="36"/>
+          <w:lang w:val="uk-UA"/>
+        </w:rPr>
+        <w:t xml:space="preserve">Спочатку проведемо тестування при довільньому параметру дельта, а вже на наступному слайді підберемо найкращий варіант. </w:t>
+      </w:r>
+    </w:p>
+    <w:p>
+      <w:pPr>
+        <w:ind w:firstLine="708"/>
+        <w:jc w:val="both"/>
+        <w:rPr>
+          <w:rFonts w:ascii="Times New Roman" w:hAnsi="Times New Roman" w:cs="Times New Roman"/>
+          <w:sz w:val="36"/>
+          <w:szCs w:val="36"/>
+          <w:lang w:val="uk-UA"/>
+        </w:rPr>
+      </w:pPr>
+      <w:r>
+        <w:rPr>
+          <w:rFonts w:ascii="Times New Roman" w:hAnsi="Times New Roman" w:cs="Times New Roman"/>
+          <w:sz w:val="36"/>
+          <w:szCs w:val="36"/>
+          <w:lang w:val="uk-UA"/>
+        </w:rPr>
+        <w:t>Можемо побачити на графіках, що для 12000 вершин та до 25 разів більше ребер прискорення немає, що пояснюється тим, що немає достатньої роботи на одному кроці для багатопоточності, що</w:t>
       </w:r>
       <w:bookmarkStart w:id="0" w:name="_GoBack"/>
       <w:bookmarkEnd w:id="0"/>
@@ -369,38 +634,9 @@
           <w:rFonts w:ascii="Times New Roman" w:hAnsi="Times New Roman" w:cs="Times New Roman"/>
           <w:sz w:val="36"/>
           <w:szCs w:val="36"/>
-        </w:rPr>
-        <w:t>ки. Це дозволяє гнучко балансувати між кількістю паралельної роботи та кількістю повторних релаксацій, що робить алгоритм ідеальним для сучасних систем.</w:t>
-      </w:r>
-    </w:p>
-    <w:p>
-      <w:pPr>
-        <w:rPr>
-          <w:rFonts w:ascii="Times New Roman" w:hAnsi="Times New Roman" w:cs="Times New Roman"/>
-          <w:b/>
-          <w:sz w:val="48"/>
-          <w:szCs w:val="48"/>
-          <w:lang w:val="uk-UA"/>
-        </w:rPr>
-      </w:pPr>
-      <w:r>
-        <w:rPr>
-          <w:rFonts w:ascii="Times New Roman" w:hAnsi="Times New Roman" w:cs="Times New Roman"/>
-          <w:b/>
-          <w:sz w:val="48"/>
-          <w:szCs w:val="48"/>
-        </w:rPr>
-        <w:t>Слайд</w:t>
-      </w:r>
-      <w:r>
-        <w:rPr>
-          <w:rFonts w:ascii="Times New Roman" w:hAnsi="Times New Roman" w:cs="Times New Roman"/>
-          <w:b/>
-          <w:sz w:val="48"/>
-          <w:szCs w:val="48"/>
-          <w:lang w:val="uk-UA"/>
-        </w:rPr>
-        <w:t xml:space="preserve"> 5</w:t>
+          <w:lang w:val="uk-UA"/>
+        </w:rPr>
+        <w:t xml:space="preserve"> нівелює прискорення. </w:t>
       </w:r>
     </w:p>
     <w:p>
@@ -411,45 +647,18 @@
           <w:rFonts w:ascii="Times New Roman" w:hAnsi="Times New Roman" w:cs="Times New Roman"/>
           <w:sz w:val="36"/>
           <w:szCs w:val="36"/>
-        </w:rPr>
-      </w:pPr>
-      <w:r>
-        <w:rPr>
-          <w:rFonts w:ascii="Times New Roman" w:hAnsi="Times New Roman" w:cs="Times New Roman"/>
-          <w:sz w:val="36"/>
-          <w:szCs w:val="36"/>
-        </w:rPr>
-        <w:t>Як відомо, головною перепоною для розпаралелювання в Python є GIL (Глобальне блокування інтерпретатора). Тому замість потоків я використав незалежні процеси через модуль multiprocessing. А щоб уникнути катастрофічних затримок на копіюванні графів між процесами, я повністю розмістив усі структури даних у спільній пам'яті за допомогою SharedMemory з бібліотеки NumPy.</w:t>
-      </w:r>
-    </w:p>
-    <w:p>
-      <w:pPr>
-        <w:rPr>
-          <w:rFonts w:ascii="Times New Roman" w:hAnsi="Times New Roman" w:cs="Times New Roman"/>
-          <w:b/>
-          <w:sz w:val="48"/>
-          <w:szCs w:val="48"/>
-          <w:lang w:val="uk-UA"/>
-        </w:rPr>
-      </w:pPr>
-      <w:r>
-        <w:rPr>
-          <w:rFonts w:ascii="Times New Roman" w:hAnsi="Times New Roman" w:cs="Times New Roman"/>
-          <w:b/>
-          <w:sz w:val="48"/>
-          <w:szCs w:val="48"/>
-        </w:rPr>
-        <w:t xml:space="preserve">Слайд </w:t>
-      </w:r>
-      <w:r>
-        <w:rPr>
-          <w:rFonts w:ascii="Times New Roman" w:hAnsi="Times New Roman" w:cs="Times New Roman"/>
-          <w:b/>
-          <w:sz w:val="48"/>
-          <w:szCs w:val="48"/>
-          <w:lang w:val="uk-UA"/>
-        </w:rPr>
-        <w:t>6</w:t>
+          <w:lang w:val="uk-UA"/>
+        </w:rPr>
+      </w:pPr>
+      <w:r>
+        <w:rPr>
+          <w:rFonts w:ascii="Times New Roman" w:hAnsi="Times New Roman" w:cs="Times New Roman"/>
+          <w:sz w:val="36"/>
+          <w:szCs w:val="36"/>
+          <w:lang w:val="uk-UA"/>
+        </w:rPr>
+        <w:lastRenderedPageBreak/>
+        <w:t xml:space="preserve">Далі, якщо збільшити кількість вершин до 120000 та в 7-8 разів більше вершин, прискорення все ще не буде, проте ми вже сильно наближаємося до значення більше за 1. </w:t>
       </w:r>
     </w:p>
     <w:p>
@@ -460,221 +669,6 @@
           <w:rFonts w:ascii="Times New Roman" w:hAnsi="Times New Roman" w:cs="Times New Roman"/>
           <w:sz w:val="36"/>
           <w:szCs w:val="36"/>
-          <w:lang w:val="ru-RU"/>
-        </w:rPr>
-      </w:pPr>
-      <w:r>
-        <w:rPr>
-          <w:rFonts w:ascii="Times New Roman" w:hAnsi="Times New Roman" w:cs="Times New Roman"/>
-          <w:sz w:val="36"/>
-          <w:szCs w:val="36"/>
-        </w:rPr>
-        <w:t>Для безпечної роботи зі спільною пам'яттю було реалізовано дворівневе гранулярне блокування. Я</w:t>
-      </w:r>
-      <w:r>
-        <w:rPr>
-          <w:rFonts w:ascii="Times New Roman" w:hAnsi="Times New Roman" w:cs="Times New Roman"/>
-          <w:sz w:val="36"/>
-          <w:szCs w:val="36"/>
-        </w:rPr>
-        <w:t xml:space="preserve"> використав незалежні м'</w:t>
-      </w:r>
-      <w:r>
-        <w:rPr>
-          <w:rFonts w:ascii="Times New Roman" w:hAnsi="Times New Roman" w:cs="Times New Roman"/>
-          <w:sz w:val="36"/>
-          <w:szCs w:val="36"/>
-        </w:rPr>
-        <w:t>ютекси –</w:t>
-      </w:r>
-      <w:r>
-        <w:rPr>
-          <w:rFonts w:ascii="Times New Roman" w:hAnsi="Times New Roman" w:cs="Times New Roman"/>
-          <w:sz w:val="36"/>
-          <w:szCs w:val="36"/>
-        </w:rPr>
-        <w:t xml:space="preserve"> окремо для масиву відстаней і окремо для масиву кошиків. Крім того,</w:t>
-      </w:r>
-      <w:r>
-        <w:rPr>
-          <w:rFonts w:ascii="Times New Roman" w:hAnsi="Times New Roman" w:cs="Times New Roman"/>
-          <w:sz w:val="36"/>
-          <w:szCs w:val="36"/>
-        </w:rPr>
-        <w:t xml:space="preserve"> задля забезпечення якумога меншої кількості блокувань,</w:t>
-      </w:r>
-      <w:r>
-        <w:rPr>
-          <w:rFonts w:ascii="Times New Roman" w:hAnsi="Times New Roman" w:cs="Times New Roman"/>
-          <w:sz w:val="36"/>
-          <w:szCs w:val="36"/>
-        </w:rPr>
-        <w:t xml:space="preserve"> робочі процеси спочатку акумулюють знайдені шляхи локально, і лише потім пакето</w:t>
-      </w:r>
-      <w:r>
-        <w:rPr>
-          <w:rFonts w:ascii="Times New Roman" w:hAnsi="Times New Roman" w:cs="Times New Roman"/>
-          <w:sz w:val="36"/>
-          <w:szCs w:val="36"/>
-        </w:rPr>
-        <w:t>м скидають їх у спільну пам'ять.</w:t>
-      </w:r>
-    </w:p>
-    <w:p>
-      <w:pPr>
-        <w:rPr>
-          <w:rFonts w:ascii="Times New Roman" w:hAnsi="Times New Roman" w:cs="Times New Roman"/>
-          <w:b/>
-          <w:sz w:val="48"/>
-          <w:szCs w:val="48"/>
-          <w:lang w:val="uk-UA"/>
-        </w:rPr>
-      </w:pPr>
-      <w:r>
-        <w:rPr>
-          <w:rFonts w:ascii="Times New Roman" w:hAnsi="Times New Roman" w:cs="Times New Roman"/>
-          <w:b/>
-          <w:sz w:val="48"/>
-          <w:szCs w:val="48"/>
-        </w:rPr>
-        <w:t xml:space="preserve">Слайд </w:t>
-      </w:r>
-      <w:r>
-        <w:rPr>
-          <w:rFonts w:ascii="Times New Roman" w:hAnsi="Times New Roman" w:cs="Times New Roman"/>
-          <w:b/>
-          <w:sz w:val="48"/>
-          <w:szCs w:val="48"/>
-          <w:lang w:val="uk-UA"/>
-        </w:rPr>
-        <w:t>7</w:t>
-      </w:r>
-    </w:p>
-    <w:p>
-      <w:pPr>
-        <w:jc w:val="both"/>
-        <w:rPr>
-          <w:rFonts w:ascii="Times New Roman" w:hAnsi="Times New Roman" w:cs="Times New Roman"/>
-          <w:sz w:val="36"/>
-          <w:szCs w:val="36"/>
-          <w:lang w:val="uk-UA"/>
-        </w:rPr>
-      </w:pPr>
-      <w:r>
-        <w:rPr>
-          <w:rFonts w:ascii="Times New Roman" w:hAnsi="Times New Roman" w:cs="Times New Roman"/>
-          <w:sz w:val="36"/>
-          <w:szCs w:val="36"/>
-        </w:rPr>
-        <w:tab/>
-      </w:r>
-      <w:r>
-        <w:rPr>
-          <w:rFonts w:ascii="Times New Roman" w:hAnsi="Times New Roman" w:cs="Times New Roman"/>
-          <w:sz w:val="36"/>
-          <w:szCs w:val="36"/>
-          <w:lang w:val="uk-UA"/>
-        </w:rPr>
-        <w:t>Далі перейдемо до аналізу прискорення та ефективності паралельної версії алгоритму у порівнянні із послідовною.</w:t>
-      </w:r>
-      <w:r>
-        <w:rPr>
-          <w:rFonts w:ascii="Times New Roman" w:hAnsi="Times New Roman" w:cs="Times New Roman"/>
-          <w:sz w:val="36"/>
-          <w:szCs w:val="36"/>
-        </w:rPr>
-        <w:t xml:space="preserve"> В</w:t>
-      </w:r>
-      <w:r>
-        <w:rPr>
-          <w:rFonts w:ascii="Times New Roman" w:hAnsi="Times New Roman" w:cs="Times New Roman"/>
-          <w:sz w:val="36"/>
-          <w:szCs w:val="36"/>
-        </w:rPr>
-        <w:t>арто зазнчити, що тестування провидлося на системі із 8 ядрами</w:t>
-      </w:r>
-      <w:r>
-        <w:rPr>
-          <w:rFonts w:ascii="Times New Roman" w:hAnsi="Times New Roman" w:cs="Times New Roman"/>
-          <w:sz w:val="36"/>
-          <w:szCs w:val="36"/>
-          <w:lang w:val="uk-UA"/>
-        </w:rPr>
-        <w:t xml:space="preserve"> та 16 потоками. </w:t>
-      </w:r>
-    </w:p>
-    <w:p>
-      <w:pPr>
-        <w:ind w:firstLine="708"/>
-        <w:jc w:val="both"/>
-        <w:rPr>
-          <w:rFonts w:ascii="Times New Roman" w:hAnsi="Times New Roman" w:cs="Times New Roman"/>
-          <w:sz w:val="36"/>
-          <w:szCs w:val="36"/>
-          <w:lang w:val="uk-UA"/>
-        </w:rPr>
-      </w:pPr>
-      <w:r>
-        <w:rPr>
-          <w:rFonts w:ascii="Times New Roman" w:hAnsi="Times New Roman" w:cs="Times New Roman"/>
-          <w:sz w:val="36"/>
-          <w:szCs w:val="36"/>
-          <w:lang w:val="uk-UA"/>
-        </w:rPr>
-        <w:t xml:space="preserve">Спочатку проведемо тестування при довільньому параметру дельта, а вже на наступному слайді підберемо найкращий варіант. </w:t>
-      </w:r>
-    </w:p>
-    <w:p>
-      <w:pPr>
-        <w:ind w:firstLine="708"/>
-        <w:jc w:val="both"/>
-        <w:rPr>
-          <w:rFonts w:ascii="Times New Roman" w:hAnsi="Times New Roman" w:cs="Times New Roman"/>
-          <w:sz w:val="36"/>
-          <w:szCs w:val="36"/>
-          <w:lang w:val="uk-UA"/>
-        </w:rPr>
-      </w:pPr>
-      <w:r>
-        <w:rPr>
-          <w:rFonts w:ascii="Times New Roman" w:hAnsi="Times New Roman" w:cs="Times New Roman"/>
-          <w:sz w:val="36"/>
-          <w:szCs w:val="36"/>
-          <w:lang w:val="uk-UA"/>
-        </w:rPr>
-        <w:lastRenderedPageBreak/>
-        <w:t xml:space="preserve">Можемо побачити на графіках, що для 12000 вершин та до 25 разів більше ребер прискорення немає, що пояснюється тим, що немає достатньої роботи на одному кроці для багатопоточності, що нівелює прискорення. </w:t>
-      </w:r>
-    </w:p>
-    <w:p>
-      <w:pPr>
-        <w:ind w:firstLine="708"/>
-        <w:jc w:val="both"/>
-        <w:rPr>
-          <w:rFonts w:ascii="Times New Roman" w:hAnsi="Times New Roman" w:cs="Times New Roman"/>
-          <w:sz w:val="36"/>
-          <w:szCs w:val="36"/>
-          <w:lang w:val="uk-UA"/>
-        </w:rPr>
-      </w:pPr>
-      <w:r>
-        <w:rPr>
-          <w:rFonts w:ascii="Times New Roman" w:hAnsi="Times New Roman" w:cs="Times New Roman"/>
-          <w:sz w:val="36"/>
-          <w:szCs w:val="36"/>
-          <w:lang w:val="uk-UA"/>
-        </w:rPr>
-        <w:t xml:space="preserve">Далі, якщо збільшити кількість вершин до 120000 та в 7-8 разів більше вершин, прискорення все ще не буде, проте ми вже сильно наближаємося до значення більше за 1. </w:t>
-      </w:r>
-    </w:p>
-    <w:p>
-      <w:pPr>
-        <w:ind w:firstLine="708"/>
-        <w:jc w:val="both"/>
-        <w:rPr>
-          <w:rFonts w:ascii="Times New Roman" w:hAnsi="Times New Roman" w:cs="Times New Roman"/>
-          <w:sz w:val="36"/>
-          <w:szCs w:val="36"/>
           <w:lang w:val="uk-UA"/>
         </w:rPr>
       </w:pPr>
@@ -692,26 +686,8 @@
           <w:rFonts w:ascii="Times New Roman" w:hAnsi="Times New Roman" w:cs="Times New Roman"/>
           <w:sz w:val="36"/>
           <w:szCs w:val="36"/>
-          <w:lang w:val="ru-RU"/>
-        </w:rPr>
-        <w:t>, то побачимо, що прискорення пробива</w:t>
-      </w:r>
-      <w:r>
-        <w:rPr>
-          <w:rFonts w:ascii="Times New Roman" w:hAnsi="Times New Roman" w:cs="Times New Roman"/>
-          <w:sz w:val="36"/>
-          <w:szCs w:val="36"/>
-        </w:rPr>
-        <w:t xml:space="preserve">є значення 1 </w:t>
-      </w:r>
-      <w:r>
-        <w:rPr>
-          <w:rFonts w:ascii="Times New Roman" w:hAnsi="Times New Roman" w:cs="Times New Roman"/>
-          <w:sz w:val="36"/>
-          <w:szCs w:val="36"/>
-          <w:lang w:val="ru-RU"/>
-        </w:rPr>
-        <w:t>на 4 та 8 ядрах. На цьому етапі</w:t>
+        </w:rPr>
+        <w:t>, то побачимо, що прискорення пробиває значення 1 на 4 та 8 ядрах. На цьому етапі</w:t>
       </w:r>
       <w:r>
         <w:rPr>
@@ -847,9 +823,18 @@
           <w:szCs w:val="36"/>
           <w:lang w:val="uk-UA"/>
         </w:rPr>
+        <w:tab/>
+        <w:t xml:space="preserve">Використання 32 потоків, що більше за кількість логічних ядер, як можна побачити із графіків, є недоцільним через пермикання контексту. Така кількість потоків є завжде </w:t>
+      </w:r>
+      <w:r>
+        <w:rPr>
+          <w:rFonts w:ascii="Times New Roman" w:hAnsi="Times New Roman" w:cs="Times New Roman"/>
+          <w:sz w:val="36"/>
+          <w:szCs w:val="36"/>
+          <w:lang w:val="uk-UA"/>
+        </w:rPr>
         <w:lastRenderedPageBreak/>
-        <w:tab/>
-        <w:t xml:space="preserve">Використання 32 потоків, що більше за кількість логічних ядер, як можна побачити із графіків, є недоцільним через пермикання контексту. Така кількість потоків є завжде повільнішою за 16 потоків, що дорівнює кількості логічних ядер.  </w:t>
+        <w:t xml:space="preserve">повільнішою за 16 потоків, що дорівнює кількості логічних ядер.  </w:t>
       </w:r>
     </w:p>
     <w:p>
@@ -1012,7 +997,7 @@
           <w:rFonts w:ascii="Times New Roman" w:hAnsi="Times New Roman" w:cs="Times New Roman"/>
           <w:sz w:val="36"/>
           <w:szCs w:val="36"/>
-          <w:lang w:val="ru-RU"/>
+          <w:lang w:val="uk-UA"/>
         </w:rPr>
         <w:t xml:space="preserve">алгоритм дейкстри </w:t>
       </w:r>
@@ -1061,7 +1046,6 @@
           <w:rFonts w:ascii="Times New Roman" w:hAnsi="Times New Roman" w:cs="Times New Roman"/>
           <w:sz w:val="36"/>
           <w:szCs w:val="36"/>
-          <w:lang w:val="ru-RU"/>
         </w:rPr>
         <w:t xml:space="preserve">. Оскільки паралелізація направлена на великі графіки, то </w:t>
       </w:r>
@@ -1113,39 +1097,36 @@
           <w:rFonts w:ascii="Times New Roman" w:hAnsi="Times New Roman" w:cs="Times New Roman"/>
           <w:sz w:val="36"/>
           <w:szCs w:val="36"/>
-          <w:lang w:val="ru-RU"/>
-        </w:rPr>
-      </w:pPr>
-      <w:r>
-        <w:rPr>
-          <w:rFonts w:ascii="Times New Roman" w:hAnsi="Times New Roman" w:cs="Times New Roman"/>
-          <w:sz w:val="36"/>
-          <w:szCs w:val="36"/>
-          <w:lang w:val="uk-UA"/>
+        </w:rPr>
+      </w:pPr>
+      <w:r>
+        <w:rPr>
+          <w:rFonts w:ascii="Times New Roman" w:hAnsi="Times New Roman" w:cs="Times New Roman"/>
+          <w:sz w:val="36"/>
+          <w:szCs w:val="36"/>
+          <w:lang w:val="uk-UA"/>
+        </w:rPr>
+        <w:t>Ось такі значення прискорення та ефективності можемо отримати, якщо взяти параметр дельта, що дорівнює оптимальному для паралельної версії, тобто 2.</w:t>
+      </w:r>
+    </w:p>
+    <w:p>
+      <w:pPr>
+        <w:ind w:firstLine="708"/>
+        <w:jc w:val="both"/>
+        <w:rPr>
+          <w:rFonts w:ascii="Times New Roman" w:hAnsi="Times New Roman" w:cs="Times New Roman"/>
+          <w:b/>
+          <w:sz w:val="48"/>
+          <w:szCs w:val="48"/>
+        </w:rPr>
+      </w:pPr>
+      <w:r>
+        <w:rPr>
+          <w:rFonts w:ascii="Times New Roman" w:hAnsi="Times New Roman" w:cs="Times New Roman"/>
+          <w:sz w:val="36"/>
+          <w:szCs w:val="36"/>
         </w:rPr>
         <w:lastRenderedPageBreak/>
-        <w:t>Ось такі значення прискорення та ефективності можемо отримати, якщо взяти параметр дельта, що дорівнює оптимальному для паралельної версії, тобто 2.</w:t>
-      </w:r>
-    </w:p>
-    <w:p>
-      <w:pPr>
-        <w:ind w:firstLine="708"/>
-        <w:jc w:val="both"/>
-        <w:rPr>
-          <w:rFonts w:ascii="Times New Roman" w:hAnsi="Times New Roman" w:cs="Times New Roman"/>
-          <w:b/>
-          <w:sz w:val="48"/>
-          <w:szCs w:val="48"/>
-          <w:lang w:val="ru-RU"/>
-        </w:rPr>
-      </w:pPr>
-      <w:r>
-        <w:rPr>
-          <w:rFonts w:ascii="Times New Roman" w:hAnsi="Times New Roman" w:cs="Times New Roman"/>
-          <w:sz w:val="36"/>
-          <w:szCs w:val="36"/>
-          <w:lang w:val="ru-RU"/>
-        </w:rPr>
         <w:t>Результати трохи краще, ніж були на позаминулому слайді, оскільки тут паралельна версія показує найбільшу швидкодію, а послідовна стає</w:t>
       </w:r>
       <w:r>
@@ -1162,7 +1143,6 @@
           <w:rFonts w:ascii="Times New Roman" w:hAnsi="Times New Roman" w:cs="Times New Roman"/>
           <w:sz w:val="36"/>
           <w:szCs w:val="36"/>
-          <w:lang w:val="ru-RU"/>
         </w:rPr>
         <w:t>трохи гіршою</w:t>
       </w:r>

</xml_diff>